<commit_message>
A fault card says nothing about when it is dealt
Every card carried its round on the header line — ROUND 0 to ROUND 4, or
REFERENCE CHAIN and LATE SHIFT for the library decks. The owner asked for
the round text to go. The header now reads the sector code and name alone,
over the hairline in the sector colour; the round label map and the tab
line are gone from tools/kit/build_cards.js, and the deck stays in
numerical order, which is the only order a table needs. The three tests
that pinned the round label in the generator's source now assert its
absence. The guidebook no longer describes the deck as sectioned and tells
the facilitator to re-sort it by code. Both kits' decks and guidebooks are
rebuilt; the exported deck is still four landscape sheets of fifteen with
every code, triangle, TIME-CRITICAL word and footer in place and no round
or section word anywhere on a card.

Co-Authored-By: Claude Fable 5.1 <noreply@anthropic.com>
</commit_message>
<xml_diff>
--- a/B&W Kit/UNDERCITY_Facilitator_Guidebook_BW.docx
+++ b/B&W Kit/UNDERCITY_Facilitator_Guidebook_BW.docx
@@ -3739,7 +3739,7 @@
           <w:sz w:val="20"/>
           <w:szCs w:val="20"/>
         </w:rPr>
-        <w:t xml:space="preserve">Every binder's Fault Code Index ends with two more procedures, P-09 and P-10, and the card deck has a LATE SHIFT section after REFERENCE CHAIN. They add no mechanic. A P-09 fault needs three values: two from other binders exactly as Round 3's did and, since 2026-10-06, a third from its own table, its own Appendix C or a third sector. Every P-08 reference chain carries a third value the same way, so each sector holds exactly two three-value faults and the library tags them 3 VALUES — introduce them in Round 5, one table at a time, and never on a P-10, which stays at two values under time pressure. A P-10 fault is the same with three crew, heavier materials and Integrity falling three points a minute while it stays open: the card says TIME-CRITICAL and nothing counts down, because nothing does — the control panel's preview shows you a target time to call out loud if the room needs the pressure, and that is all it is. They exist so Rounds 4 to 7 can mix every kind of fault the room has learned without repeating one. Fire them from the library like everything else; the preview shows you every source and the answer, and no table ever sees that.</w:t>
+        <w:t xml:space="preserve">Every binder's Fault Code Index ends with two more procedures, P-09 and P-10, and the card deck prints them in numerical order like every other card, with no section or round on the card. They add no mechanic. A P-09 fault needs three values: two from other binders exactly as Round 3's did and, since 2026-10-06, a third from its own table, its own Appendix C or a third sector. Every P-08 reference chain carries a third value the same way, so each sector holds exactly two three-value faults and the library tags them 3 VALUES — introduce them in Round 5, one table at a time, and never on a P-10, which stays at two values under time pressure. A P-10 fault is the same with three crew, heavier materials and Integrity falling three points a minute while it stays open: the card says TIME-CRITICAL and nothing counts down, because nothing does — the control panel's preview shows you a target time to call out loud if the room needs the pressure, and that is all it is. They exist so Rounds 4 to 7 can mix every kind of fault the room has learned without repeating one. Fire them from the library like everything else; the preview shows you every source and the answer, and no table ever sees that.</w:t>
       </w:r>
     </w:p>
     <w:p>
@@ -12900,7 +12900,7 @@
               <w:rPr>
                 <w:rFonts w:ascii="Arial" w:cs="Arial" w:eastAsia="Arial" w:hAnsi="Arial"/>
               </w:rPr>
-              <w:t xml:space="preserve">If the optional fault deck was used, collect every card from tables and floor, re-sort by section tab and count to 60.</w:t>
+              <w:t xml:space="preserve">If the optional fault deck was used, collect every card from tables and floor, re-sort by code and count to 60.</w:t>
             </w:r>
           </w:p>
         </w:tc>

</xml_diff>